<commit_message>
Add Testing Procedures documents for C1, C13, C17, C4 and C25 (no tables)
- One BSI.IT.23.Cx_..._Testing_Procedures.docx per control in the format of the
  C25 Testing Procedures provided; tables rewritten as bullet paragraphs
- C25 document keeps the provided content; IDs aligned with the package
  (OI-04 -> OI-06, OBS-03/04/05 -> OBS-01/03/10) and 10/30 re-performance noted
- OI-06 / OBS-10 carried into the C25 workpaper, Design/WT doc and summary index
- Rebuilt full zip and email-size 7z

Co-Authored-By: Claude Opus 5.5 <noreply@anthropic.com>
Claude-Session: https://claude.ai/code/session_01RkbhuE8rWvfJG8fUAag8f1
</commit_message>
<xml_diff>
--- a/SDLC 2026 - BSI Control Testing/BSI.IT.23.C25 Implement & Deployment/BSI.IT.23.C25_SDLC_Design_WT_Sample_of_1_NDF_RLSE1270306.docx
+++ b/SDLC 2026 - BSI Control Testing/BSI.IT.23.C25 Implement & Deployment/BSI.IT.23.C25_SDLC_Design_WT_Sample_of_1_NDF_RLSE1270306.docx
@@ -204,7 +204,7 @@
                 <w:color w:val="17365D"/>
                 <w:sz w:val="26"/>
               </w:rPr>
-              <w:t>SATISFACTORY</w:t>
+              <w:t>SATISFACTORY (PRELIM.)</w:t>
             </w:r>
           </w:p>
         </w:tc>
@@ -225,7 +225,7 @@
                 <w:color w:val="17365D"/>
                 <w:sz w:val="26"/>
               </w:rPr>
-              <w:t>OI-03</w:t>
+              <w:t>OI-03, OI-06</w:t>
             </w:r>
           </w:p>
         </w:tc>
@@ -1752,6 +1752,20 @@
         <w:rPr>
           <w:rFonts w:ascii="Aptos" w:hAnsi="Aptos" w:cs="Aptos" w:eastAsia="Aptos"/>
           <w:b w:val="0"/>
+          <w:i/>
+          <w:sz w:val="18"/>
+        </w:rPr>
+        <w:t>OI-06: for all four releases (including RLSE1270306, final PIP attached 01/28/2026 02:09 after the 01/27/2026 approvals) the final plan was attached after the last approval and earlier versions were deleted – confirmation requested from the control owner; see the C25 Testing Procedures.</w:t>
+      </w:r>
+    </w:p>
+    <w:p>
+      <w:pPr>
+        <w:spacing w:after="120"/>
+      </w:pPr>
+      <w:r>
+        <w:rPr>
+          <w:rFonts w:ascii="Aptos" w:hAnsi="Aptos" w:cs="Aptos" w:eastAsia="Aptos"/>
+          <w:b w:val="0"/>
           <w:i w:val="0"/>
           <w:sz w:val="20"/>
         </w:rPr>

</xml_diff>